<commit_message>
feat: update english invoice template and generate F-0010-2026 PDF
</commit_message>
<xml_diff>
--- a/legal/facturas_emitidas/J2T/2026/F-0010-2026_invoice_en.docx
+++ b/legal/facturas_emitidas/J2T/2026/F-0010-2026_invoice_en.docx
@@ -105,7 +105,7 @@
           <w:vertAlign w:val="baseline"/>
           <w:rtl w:val="0"/>
         </w:rPr>
-        <w:t xml:space="preserve">F-00</w:t>
+        <w:t xml:space="preserve">F-0010-2026 </w:t>
       </w:r>
       <w:r>
         <w:rPr>
@@ -114,7 +114,7 @@
           <w:szCs w:val="32"/>
           <w:rtl w:val="0"/>
         </w:rPr>
-        <w:t xml:space="preserve">10</w:t>
+        <w:t xml:space="preserve"/>
       </w:r>
       <w:r>
         <w:rPr>
@@ -133,7 +133,7 @@
           <w:vertAlign w:val="baseline"/>
           <w:rtl w:val="0"/>
         </w:rPr>
-        <w:t xml:space="preserve">-</w:t>
+        <w:t xml:space="preserve"/>
       </w:r>
       <w:r>
         <w:rPr>
@@ -152,7 +152,7 @@
           <w:vertAlign w:val="baseline"/>
           <w:rtl w:val="0"/>
         </w:rPr>
-        <w:t xml:space="preserve">202</w:t>
+        <w:t xml:space="preserve"/>
       </w:r>
       <w:r>
         <w:rPr>
@@ -171,7 +171,7 @@
           <w:vertAlign w:val="baseline"/>
           <w:rtl w:val="0"/>
         </w:rPr>
-        <w:t xml:space="preserve">6 </w:t>
+        <w:t xml:space="preserve"/>
       </w:r>
     </w:p>
     <w:p>
@@ -267,7 +267,7 @@
           <w:szCs w:val="20"/>
           <w:rtl w:val="0"/>
         </w:rPr>
-        <w:t xml:space="preserve">30</w:t>
+        <w:t xml:space="preserve">30/10/2026 </w:t>
       </w:r>
       <w:r>
         <w:rPr>
@@ -286,7 +286,7 @@
           <w:vertAlign w:val="baseline"/>
           <w:rtl w:val="0"/>
         </w:rPr>
-        <w:t xml:space="preserve">/</w:t>
+        <w:t xml:space="preserve"/>
       </w:r>
       <w:r>
         <w:rPr>
@@ -295,7 +295,7 @@
           <w:szCs w:val="20"/>
           <w:rtl w:val="0"/>
         </w:rPr>
-        <w:t xml:space="preserve">10</w:t>
+        <w:t xml:space="preserve"/>
       </w:r>
       <w:r>
         <w:rPr>
@@ -314,515 +314,510 @@
           <w:vertAlign w:val="baseline"/>
           <w:rtl w:val="0"/>
         </w:rPr>
-        <w:t xml:space="preserve">/2026 </w:t>
+        <w:t xml:space="preserve"/>
       </w:r>
     </w:p>
-    <w:p>
-      <w:pPr>
-        <w:keepNext w:val="0"/>
-        <w:keepLines w:val="0"/>
-        <w:pageBreakBefore w:val="0"/>
-        <w:widowControl w:val="0"/>
-        <w:pBdr>
-          <w:top w:space="0" w:sz="0" w:val="nil"/>
-          <w:left w:space="0" w:sz="0" w:val="nil"/>
-          <w:bottom w:space="0" w:sz="0" w:val="nil"/>
-          <w:right w:space="0" w:sz="0" w:val="nil"/>
-          <w:between w:space="0" w:sz="0" w:val="nil"/>
-        </w:pBdr>
-        <w:shd w:fill="auto" w:val="clear"/>
-        <w:spacing w:after="0" w:before="505.53955078125" w:line="240" w:lineRule="auto"/>
-        <w:ind w:left="0" w:right="0" w:firstLine="0"/>
+    <w:tbl>
+      <w:tblPr>
+        <w:tblW w:w="10295" w:type="dxa"/>
         <w:jc w:val="left"/>
-        <w:rPr>
-          <w:rFonts w:ascii="Inter" w:cs="Inter" w:eastAsia="Inter" w:hAnsi="Inter"/>
-          <w:b w:val="0"/>
-          <w:bCs w:val="0"/>
-          <w:i w:val="0"/>
-          <w:iCs w:val="0"/>
-          <w:smallCaps w:val="0"/>
-          <w:strike w:val="0"/>
-          <w:color w:val="000000"/>
-          <w:sz w:val="20"/>
-          <w:szCs w:val="20"/>
-          <w:u w:val="none"/>
-          <w:shd w:fill="auto" w:val="clear"/>
-          <w:vertAlign w:val="baseline"/>
-        </w:rPr>
-      </w:pPr>
-      <w:r>
-        <w:rPr>
-          <w:rFonts w:ascii="Inter" w:cs="Inter" w:eastAsia="Inter" w:hAnsi="Inter"/>
-          <w:b w:val="0"/>
-          <w:bCs w:val="0"/>
-          <w:i w:val="0"/>
-          <w:iCs w:val="0"/>
-          <w:smallCaps w:val="0"/>
-          <w:strike w:val="0"/>
-          <w:color w:val="000000"/>
-          <w:sz w:val="20"/>
-          <w:szCs w:val="20"/>
-          <w:u w:val="none"/>
-          <w:shd w:fill="auto" w:val="clear"/>
-          <w:vertAlign w:val="baseline"/>
-          <w:rtl w:val="0"/>
-        </w:rPr>
-        <w:t xml:space="preserve">To </w:t>
-      </w:r>
-    </w:p>
-    <w:p>
-      <w:pPr>
-        <w:keepNext w:val="0"/>
-        <w:keepLines w:val="0"/>
-        <w:pageBreakBefore w:val="0"/>
-        <w:widowControl w:val="0"/>
-        <w:pBdr>
-          <w:top w:space="0" w:sz="0" w:val="nil"/>
-          <w:left w:space="0" w:sz="0" w:val="nil"/>
-          <w:bottom w:space="0" w:sz="0" w:val="nil"/>
-          <w:right w:space="0" w:sz="0" w:val="nil"/>
-          <w:between w:space="0" w:sz="0" w:val="nil"/>
-        </w:pBdr>
-        <w:shd w:fill="auto" w:val="clear"/>
-        <w:spacing w:after="0" w:before="105.460205078125" w:line="240" w:lineRule="auto"/>
-        <w:ind w:left="0" w:right="0" w:firstLine="0"/>
-        <w:jc w:val="left"/>
-        <w:rPr>
-          <w:rFonts w:ascii="Inter" w:cs="Inter" w:eastAsia="Inter" w:hAnsi="Inter"/>
-          <w:b w:val="0"/>
-          <w:bCs w:val="0"/>
-          <w:i w:val="0"/>
-          <w:iCs w:val="0"/>
-          <w:smallCaps w:val="0"/>
-          <w:strike w:val="0"/>
-          <w:color w:val="000000"/>
-          <w:sz w:val="20"/>
-          <w:szCs w:val="20"/>
-          <w:u w:val="none"/>
-          <w:shd w:fill="auto" w:val="clear"/>
-          <w:vertAlign w:val="baseline"/>
-        </w:rPr>
-      </w:pPr>
-      <w:r>
-        <w:rPr>
-          <w:rFonts w:ascii="Inter" w:cs="Inter" w:eastAsia="Inter" w:hAnsi="Inter"/>
-          <w:sz w:val="20"/>
-          <w:szCs w:val="20"/>
-          <w:rtl w:val="0"/>
-        </w:rPr>
-        <w:t xml:space="preserve">J2T Services Ltd</w:t>
-      </w:r>
-      <w:r>
-        <w:rPr>
-          <w:rFonts w:ascii="Inter" w:cs="Inter" w:eastAsia="Inter" w:hAnsi="Inter"/>
-          <w:b w:val="0"/>
-          <w:bCs w:val="0"/>
-          <w:i w:val="0"/>
-          <w:iCs w:val="0"/>
-          <w:smallCaps w:val="0"/>
-          <w:strike w:val="0"/>
-          <w:color w:val="000000"/>
-          <w:sz w:val="20"/>
-          <w:szCs w:val="20"/>
-          <w:u w:val="none"/>
-          <w:shd w:fill="auto" w:val="clear"/>
-          <w:vertAlign w:val="baseline"/>
-          <w:rtl w:val="0"/>
-        </w:rPr>
-        <w:t xml:space="preserve">. </w:t>
-      </w:r>
-    </w:p>
-    <w:p>
-      <w:pPr>
-        <w:keepNext w:val="0"/>
-        <w:keepLines w:val="0"/>
-        <w:pageBreakBefore w:val="0"/>
-        <w:widowControl w:val="0"/>
-        <w:pBdr>
-          <w:top w:space="0" w:sz="0" w:val="nil"/>
-          <w:left w:space="0" w:sz="0" w:val="nil"/>
-          <w:bottom w:space="0" w:sz="0" w:val="nil"/>
-          <w:right w:space="0" w:sz="0" w:val="nil"/>
-          <w:between w:space="0" w:sz="0" w:val="nil"/>
-        </w:pBdr>
-        <w:shd w:fill="auto" w:val="clear"/>
-        <w:spacing w:after="0" w:before="105.46142578125" w:line="240" w:lineRule="auto"/>
-        <w:ind w:left="0" w:right="0" w:firstLine="0"/>
-        <w:jc w:val="left"/>
-        <w:rPr>
-          <w:rFonts w:ascii="Inter" w:cs="Inter" w:eastAsia="Inter" w:hAnsi="Inter"/>
-          <w:b w:val="0"/>
-          <w:bCs w:val="0"/>
-          <w:i w:val="0"/>
-          <w:iCs w:val="0"/>
-          <w:smallCaps w:val="0"/>
-          <w:strike w:val="0"/>
-          <w:color w:val="000000"/>
-          <w:sz w:val="20"/>
-          <w:szCs w:val="20"/>
-          <w:u w:val="none"/>
-          <w:shd w:fill="auto" w:val="clear"/>
-          <w:vertAlign w:val="baseline"/>
-        </w:rPr>
-      </w:pPr>
-      <w:r>
-        <w:rPr>
-          <w:rFonts w:ascii="Inter" w:cs="Inter" w:eastAsia="Inter" w:hAnsi="Inter"/>
-          <w:b w:val="0"/>
-          <w:bCs w:val="0"/>
-          <w:i w:val="0"/>
-          <w:iCs w:val="0"/>
-          <w:smallCaps w:val="0"/>
-          <w:strike w:val="0"/>
-          <w:color w:val="000000"/>
-          <w:sz w:val="20"/>
-          <w:szCs w:val="20"/>
-          <w:u w:val="none"/>
-          <w:shd w:fill="auto" w:val="clear"/>
-          <w:vertAlign w:val="baseline"/>
-          <w:rtl w:val="0"/>
-        </w:rPr>
-        <w:t xml:space="preserve">CY10341520V </w:t>
-      </w:r>
-    </w:p>
-    <w:p>
-      <w:pPr>
-        <w:keepNext w:val="0"/>
-        <w:keepLines w:val="0"/>
-        <w:pageBreakBefore w:val="0"/>
-        <w:widowControl w:val="0"/>
-        <w:pBdr>
-          <w:top w:space="0" w:sz="0" w:val="nil"/>
-          <w:left w:space="0" w:sz="0" w:val="nil"/>
-          <w:bottom w:space="0" w:sz="0" w:val="nil"/>
-          <w:right w:space="0" w:sz="0" w:val="nil"/>
-          <w:between w:space="0" w:sz="0" w:val="nil"/>
-        </w:pBdr>
-        <w:shd w:fill="auto" w:val="clear"/>
-        <w:spacing w:after="0" w:before="105.479736328125" w:line="338.7243175506592" w:lineRule="auto"/>
-        <w:ind w:left="0" w:right="0" w:firstLine="0"/>
-        <w:jc w:val="left"/>
-        <w:rPr>
-          <w:rFonts w:ascii="Inter" w:cs="Inter" w:eastAsia="Inter" w:hAnsi="Inter"/>
-          <w:b w:val="0"/>
-          <w:bCs w:val="0"/>
-          <w:i w:val="0"/>
-          <w:iCs w:val="0"/>
-          <w:smallCaps w:val="0"/>
-          <w:strike w:val="0"/>
-          <w:color w:val="000000"/>
-          <w:sz w:val="20"/>
-          <w:szCs w:val="20"/>
-          <w:u w:val="none"/>
-          <w:shd w:fill="auto" w:val="clear"/>
-          <w:vertAlign w:val="baseline"/>
-        </w:rPr>
-      </w:pPr>
-      <w:r>
-        <w:rPr>
-          <w:rFonts w:ascii="Inter" w:cs="Inter" w:eastAsia="Inter" w:hAnsi="Inter"/>
-          <w:b w:val="0"/>
-          <w:bCs w:val="0"/>
-          <w:i w:val="0"/>
-          <w:iCs w:val="0"/>
-          <w:smallCaps w:val="0"/>
-          <w:strike w:val="0"/>
-          <w:color w:val="000000"/>
-          <w:sz w:val="20"/>
-          <w:szCs w:val="20"/>
-          <w:u w:val="none"/>
-          <w:shd w:fill="auto" w:val="clear"/>
-          <w:vertAlign w:val="baseline"/>
-          <w:rtl w:val="0"/>
-        </w:rPr>
-        <w:t xml:space="preserve">Spyrou Kyprianou, 78, 4B Magnum Business Center, 3076 </w:t>
-      </w:r>
-    </w:p>
-    <w:p>
-      <w:pPr>
-        <w:keepNext w:val="0"/>
-        <w:keepLines w:val="0"/>
-        <w:pageBreakBefore w:val="0"/>
-        <w:widowControl w:val="0"/>
-        <w:pBdr>
-          <w:top w:space="0" w:sz="0" w:val="nil"/>
-          <w:left w:space="0" w:sz="0" w:val="nil"/>
-          <w:bottom w:space="0" w:sz="0" w:val="nil"/>
-          <w:right w:space="0" w:sz="0" w:val="nil"/>
-          <w:between w:space="0" w:sz="0" w:val="nil"/>
-        </w:pBdr>
-        <w:shd w:fill="auto" w:val="clear"/>
-        <w:spacing w:after="0" w:before="23.189697265625" w:line="240" w:lineRule="auto"/>
-        <w:ind w:left="0" w:right="0" w:firstLine="0"/>
-        <w:jc w:val="left"/>
-        <w:rPr>
-          <w:rFonts w:ascii="Inter" w:cs="Inter" w:eastAsia="Inter" w:hAnsi="Inter"/>
-          <w:b w:val="0"/>
-          <w:bCs w:val="0"/>
-          <w:i w:val="0"/>
-          <w:iCs w:val="0"/>
-          <w:smallCaps w:val="0"/>
-          <w:strike w:val="0"/>
-          <w:color w:val="000000"/>
-          <w:sz w:val="20"/>
-          <w:szCs w:val="20"/>
-          <w:u w:val="none"/>
-          <w:shd w:fill="auto" w:val="clear"/>
-          <w:vertAlign w:val="baseline"/>
-        </w:rPr>
-      </w:pPr>
-      <w:r>
-        <w:rPr>
-          <w:rFonts w:ascii="Inter" w:cs="Inter" w:eastAsia="Inter" w:hAnsi="Inter"/>
-          <w:b w:val="0"/>
-          <w:bCs w:val="0"/>
-          <w:i w:val="0"/>
-          <w:iCs w:val="0"/>
-          <w:smallCaps w:val="0"/>
-          <w:strike w:val="0"/>
-          <w:color w:val="000000"/>
-          <w:sz w:val="20"/>
-          <w:szCs w:val="20"/>
-          <w:u w:val="none"/>
-          <w:shd w:fill="auto" w:val="clear"/>
-          <w:vertAlign w:val="baseline"/>
-          <w:rtl w:val="0"/>
-        </w:rPr>
-        <w:t xml:space="preserve">Limassol, 3076, Cyprus </w:t>
-      </w:r>
-    </w:p>
-    <w:p>
-      <w:pPr>
-        <w:keepNext w:val="0"/>
-        <w:keepLines w:val="0"/>
-        <w:pageBreakBefore w:val="0"/>
-        <w:widowControl w:val="0"/>
-        <w:pBdr>
-          <w:top w:space="0" w:sz="0" w:val="nil"/>
-          <w:left w:space="0" w:sz="0" w:val="nil"/>
-          <w:bottom w:space="0" w:sz="0" w:val="nil"/>
-          <w:right w:space="0" w:sz="0" w:val="nil"/>
-          <w:between w:space="0" w:sz="0" w:val="nil"/>
-        </w:pBdr>
-        <w:shd w:fill="auto" w:val="clear"/>
-        <w:spacing w:after="0" w:before="2420.53955078125" w:line="240" w:lineRule="auto"/>
-        <w:ind w:left="0" w:right="0" w:firstLine="0"/>
-        <w:jc w:val="left"/>
-        <w:rPr>
-          <w:rFonts w:ascii="Inter" w:cs="Inter" w:eastAsia="Inter" w:hAnsi="Inter"/>
-          <w:b w:val="0"/>
-          <w:bCs w:val="0"/>
-          <w:i w:val="0"/>
-          <w:iCs w:val="0"/>
-          <w:smallCaps w:val="0"/>
-          <w:strike w:val="0"/>
-          <w:color w:val="000000"/>
-          <w:sz w:val="20"/>
-          <w:szCs w:val="20"/>
-          <w:u w:val="none"/>
-          <w:shd w:fill="auto" w:val="clear"/>
-          <w:vertAlign w:val="baseline"/>
-        </w:rPr>
-      </w:pPr>
-      <w:r>
-        <w:rPr>
-          <w:rFonts w:ascii="Inter" w:cs="Inter" w:eastAsia="Inter" w:hAnsi="Inter"/>
-          <w:b w:val="0"/>
-          <w:bCs w:val="0"/>
-          <w:i w:val="0"/>
-          <w:iCs w:val="0"/>
-          <w:smallCaps w:val="0"/>
-          <w:strike w:val="0"/>
-          <w:color w:val="000000"/>
-          <w:sz w:val="20"/>
-          <w:szCs w:val="20"/>
-          <w:u w:val="none"/>
-          <w:shd w:fill="auto" w:val="clear"/>
-          <w:vertAlign w:val="baseline"/>
-          <w:rtl w:val="0"/>
-        </w:rPr>
-        <w:t xml:space="preserve">From </w:t>
-      </w:r>
-    </w:p>
-    <w:p>
-      <w:pPr>
-        <w:keepNext w:val="0"/>
-        <w:keepLines w:val="0"/>
-        <w:pageBreakBefore w:val="0"/>
-        <w:widowControl w:val="0"/>
-        <w:pBdr>
-          <w:top w:space="0" w:sz="0" w:val="nil"/>
-          <w:left w:space="0" w:sz="0" w:val="nil"/>
-          <w:bottom w:space="0" w:sz="0" w:val="nil"/>
-          <w:right w:space="0" w:sz="0" w:val="nil"/>
-          <w:between w:space="0" w:sz="0" w:val="nil"/>
-        </w:pBdr>
-        <w:shd w:fill="auto" w:val="clear"/>
-        <w:spacing w:after="0" w:before="105.460205078125" w:line="240" w:lineRule="auto"/>
-        <w:ind w:left="0" w:right="0" w:firstLine="0"/>
-        <w:jc w:val="left"/>
-        <w:rPr>
-          <w:rFonts w:ascii="Inter" w:cs="Inter" w:eastAsia="Inter" w:hAnsi="Inter"/>
-          <w:b w:val="0"/>
-          <w:bCs w:val="0"/>
-          <w:i w:val="0"/>
-          <w:iCs w:val="0"/>
-          <w:smallCaps w:val="0"/>
-          <w:strike w:val="0"/>
-          <w:color w:val="000000"/>
-          <w:sz w:val="20"/>
-          <w:szCs w:val="20"/>
-          <w:u w:val="none"/>
-          <w:shd w:fill="auto" w:val="clear"/>
-          <w:vertAlign w:val="baseline"/>
-        </w:rPr>
-      </w:pPr>
-      <w:r>
-        <w:rPr>
-          <w:rFonts w:ascii="Inter" w:cs="Inter" w:eastAsia="Inter" w:hAnsi="Inter"/>
-          <w:b w:val="0"/>
-          <w:bCs w:val="0"/>
-          <w:i w:val="0"/>
-          <w:iCs w:val="0"/>
-          <w:smallCaps w:val="0"/>
-          <w:strike w:val="0"/>
-          <w:color w:val="000000"/>
-          <w:sz w:val="20"/>
-          <w:szCs w:val="20"/>
-          <w:u w:val="none"/>
-          <w:shd w:fill="auto" w:val="clear"/>
-          <w:vertAlign w:val="baseline"/>
-          <w:rtl w:val="0"/>
-        </w:rPr>
-        <w:t xml:space="preserve">VITALII IASINSKII </w:t>
-      </w:r>
-    </w:p>
-    <w:p>
-      <w:pPr>
-        <w:keepNext w:val="0"/>
-        <w:keepLines w:val="0"/>
-        <w:pageBreakBefore w:val="0"/>
-        <w:widowControl w:val="0"/>
-        <w:pBdr>
-          <w:top w:space="0" w:sz="0" w:val="nil"/>
-          <w:left w:space="0" w:sz="0" w:val="nil"/>
-          <w:bottom w:space="0" w:sz="0" w:val="nil"/>
-          <w:right w:space="0" w:sz="0" w:val="nil"/>
-          <w:between w:space="0" w:sz="0" w:val="nil"/>
-        </w:pBdr>
-        <w:shd w:fill="auto" w:val="clear"/>
-        <w:spacing w:after="0" w:before="105.46142578125" w:line="240" w:lineRule="auto"/>
-        <w:ind w:left="0" w:right="0" w:firstLine="0"/>
-        <w:jc w:val="left"/>
-        <w:rPr>
-          <w:rFonts w:ascii="Inter" w:cs="Inter" w:eastAsia="Inter" w:hAnsi="Inter"/>
-          <w:b w:val="0"/>
-          <w:bCs w:val="0"/>
-          <w:i w:val="0"/>
-          <w:iCs w:val="0"/>
-          <w:smallCaps w:val="0"/>
-          <w:strike w:val="0"/>
-          <w:color w:val="000000"/>
-          <w:sz w:val="20"/>
-          <w:szCs w:val="20"/>
-          <w:u w:val="none"/>
-          <w:shd w:fill="auto" w:val="clear"/>
-          <w:vertAlign w:val="baseline"/>
-        </w:rPr>
-      </w:pPr>
-      <w:r>
-        <w:rPr>
-          <w:rFonts w:ascii="Inter" w:cs="Inter" w:eastAsia="Inter" w:hAnsi="Inter"/>
-          <w:b w:val="0"/>
-          <w:bCs w:val="0"/>
-          <w:i w:val="0"/>
-          <w:iCs w:val="0"/>
-          <w:smallCaps w:val="0"/>
-          <w:strike w:val="0"/>
-          <w:color w:val="000000"/>
-          <w:sz w:val="20"/>
-          <w:szCs w:val="20"/>
-          <w:u w:val="none"/>
-          <w:shd w:fill="auto" w:val="clear"/>
-          <w:vertAlign w:val="baseline"/>
-          <w:rtl w:val="0"/>
-        </w:rPr>
-        <w:t xml:space="preserve">ESZ1154366R </w:t>
-      </w:r>
-    </w:p>
-    <w:p>
-      <w:pPr>
-        <w:widowControl w:val="0"/>
-        <w:spacing w:before="276.663818359375" w:line="244.04296875" w:lineRule="auto"/>
-        <w:ind w:left="8.799896240234375" w:right="12.0263671875" w:firstLine="4.840087890625"/>
-        <w:jc w:val="both"/>
-        <w:rPr>
-          <w:rFonts w:ascii="Inter" w:cs="Inter" w:eastAsia="Inter" w:hAnsi="Inter"/>
-          <w:b w:val="0"/>
-          <w:bCs w:val="0"/>
-          <w:i w:val="0"/>
-          <w:iCs w:val="0"/>
-          <w:smallCaps w:val="0"/>
-          <w:strike w:val="0"/>
-          <w:color w:val="000000"/>
-          <w:sz w:val="20"/>
-          <w:szCs w:val="20"/>
-          <w:u w:val="none"/>
-          <w:shd w:fill="auto" w:val="clear"/>
-          <w:vertAlign w:val="baseline"/>
-        </w:rPr>
-        <w:sectPr>
-          <w:pgSz w:h="16840" w:w="11900" w:orient="portrait"/>
-          <w:pgMar w:bottom="2041.6000366210938" w:top="828.800048828125" w:left="808.7999725341797" w:right="2997.078857421875" w:header="0" w:footer="720"/>
-          <w:pgNumType w:start="1"/>
-          <w:cols w:equalWidth="0" w:num="2">
-            <w:col w:space="0" w:w="4060"/>
-            <w:col w:space="0" w:w="4060"/>
-          </w:cols>
-        </w:sectPr>
-      </w:pPr>
-      <w:r>
-        <w:rPr>
-          <w:rFonts w:ascii="Calibri" w:cs="Calibri" w:eastAsia="Calibri" w:hAnsi="Calibri"/>
-          <w:rtl w:val="0"/>
-        </w:rPr>
-        <w:t xml:space="preserve">12166, ronda Albocacer, 11, Els Ibarsos, Sierra Engarceran, Castellon, Spain</w:t>
-      </w:r>
-      <w:r>
-        <w:rPr>
-          <w:rtl w:val="0"/>
-        </w:rPr>
-      </w:r>
-    </w:p>
-    <w:p>
-      <w:pPr>
-        <w:keepNext w:val="0"/>
-        <w:keepLines w:val="0"/>
-        <w:pageBreakBefore w:val="0"/>
-        <w:widowControl w:val="0"/>
-        <w:pBdr>
-          <w:top w:space="0" w:sz="0" w:val="nil"/>
-          <w:left w:space="0" w:sz="0" w:val="nil"/>
-          <w:bottom w:space="0" w:sz="0" w:val="nil"/>
-          <w:right w:space="0" w:sz="0" w:val="nil"/>
-          <w:between w:space="0" w:sz="0" w:val="nil"/>
-        </w:pBdr>
-        <w:shd w:fill="auto" w:val="clear"/>
-        <w:spacing w:after="0" w:before="1002.049560546875" w:line="240" w:lineRule="auto"/>
-        <w:ind w:left="0" w:right="0" w:firstLine="0"/>
-        <w:jc w:val="left"/>
-        <w:rPr>
-          <w:rFonts w:ascii="Inter" w:cs="Inter" w:eastAsia="Inter" w:hAnsi="Inter"/>
-          <w:sz w:val="20"/>
-          <w:szCs w:val="20"/>
-        </w:rPr>
-      </w:pPr>
-      <w:r>
-        <w:rPr>
-          <w:rtl w:val="0"/>
-        </w:rPr>
-      </w:r>
-    </w:p>
+        <w:tblBorders>
+          <w:top w:val="none"/>
+          <w:left w:val="none"/>
+          <w:bottom w:val="none"/>
+          <w:right w:val="none"/>
+          <w:insideH w:val="none"/>
+          <w:insideV w:val="none"/>
+        </w:tblBorders>
+        <w:tblLayout w:type="fixed"/>
+      </w:tblPr>
+      <w:tblGrid>
+        <w:gridCol w:w="5147"/>
+        <w:gridCol w:w="5147"/>
+      </w:tblGrid>
+      <w:tr>
+        <w:tc>
+          <w:tcPr>
+            <w:tcW w:w="5147" w:type="dxa"/>
+            <w:vAlign w:val="top"/>
+          </w:tcPr>
+          <w:p>
+            <w:pPr>
+              <w:keepNext w:val="0"/>
+              <w:keepLines w:val="0"/>
+              <w:pageBreakBefore w:val="0"/>
+              <w:widowControl w:val="0"/>
+              <w:pBdr>
+                <w:top w:space="0" w:sz="0" w:val="nil"/>
+                <w:left w:space="0" w:sz="0" w:val="nil"/>
+                <w:bottom w:space="0" w:sz="0" w:val="nil"/>
+                <w:right w:space="0" w:sz="0" w:val="nil"/>
+                <w:between w:space="0" w:sz="0" w:val="nil"/>
+              </w:pBdr>
+              <w:shd w:fill="auto" w:val="clear"/>
+              <w:spacing w:after="0" w:before="505.53955078125" w:line="240" w:lineRule="auto"/>
+              <w:ind w:left="0" w:right="0" w:firstLine="0"/>
+              <w:jc w:val="left"/>
+              <w:rPr>
+                <w:rFonts w:ascii="Inter" w:cs="Inter" w:eastAsia="Inter" w:hAnsi="Inter"/>
+                <w:b w:val="0"/>
+                <w:bCs w:val="0"/>
+                <w:i w:val="0"/>
+                <w:iCs w:val="0"/>
+                <w:smallCaps w:val="0"/>
+                <w:strike w:val="0"/>
+                <w:color w:val="000000"/>
+                <w:sz w:val="20"/>
+                <w:szCs w:val="20"/>
+                <w:u w:val="none"/>
+                <w:shd w:fill="auto" w:val="clear"/>
+                <w:vertAlign w:val="baseline"/>
+              </w:rPr>
+            </w:pPr>
+            <w:r>
+              <w:rPr>
+                <w:rFonts w:ascii="Inter" w:cs="Inter" w:eastAsia="Inter" w:hAnsi="Inter"/>
+                <w:b w:val="0"/>
+                <w:bCs w:val="0"/>
+                <w:i w:val="0"/>
+                <w:iCs w:val="0"/>
+                <w:smallCaps w:val="0"/>
+                <w:strike w:val="0"/>
+                <w:color w:val="000000"/>
+                <w:sz w:val="20"/>
+                <w:szCs w:val="20"/>
+                <w:u w:val="none"/>
+                <w:shd w:fill="auto" w:val="clear"/>
+                <w:vertAlign w:val="baseline"/>
+                <w:rtl w:val="0"/>
+              </w:rPr>
+              <w:t xml:space="preserve">To </w:t>
+            </w:r>
+          </w:p>
+          <w:p>
+            <w:pPr>
+              <w:keepNext w:val="0"/>
+              <w:keepLines w:val="0"/>
+              <w:pageBreakBefore w:val="0"/>
+              <w:widowControl w:val="0"/>
+              <w:pBdr>
+                <w:top w:space="0" w:sz="0" w:val="nil"/>
+                <w:left w:space="0" w:sz="0" w:val="nil"/>
+                <w:bottom w:space="0" w:sz="0" w:val="nil"/>
+                <w:right w:space="0" w:sz="0" w:val="nil"/>
+                <w:between w:space="0" w:sz="0" w:val="nil"/>
+              </w:pBdr>
+              <w:shd w:fill="auto" w:val="clear"/>
+              <w:spacing w:after="0" w:before="105.460205078125" w:line="240" w:lineRule="auto"/>
+              <w:ind w:left="0" w:right="0" w:firstLine="0"/>
+              <w:jc w:val="left"/>
+              <w:rPr>
+                <w:rFonts w:ascii="Inter" w:cs="Inter" w:eastAsia="Inter" w:hAnsi="Inter"/>
+                <w:b w:val="0"/>
+                <w:bCs w:val="0"/>
+                <w:i w:val="0"/>
+                <w:iCs w:val="0"/>
+                <w:smallCaps w:val="0"/>
+                <w:strike w:val="0"/>
+                <w:color w:val="000000"/>
+                <w:sz w:val="20"/>
+                <w:szCs w:val="20"/>
+                <w:u w:val="none"/>
+                <w:shd w:fill="auto" w:val="clear"/>
+                <w:vertAlign w:val="baseline"/>
+              </w:rPr>
+            </w:pPr>
+            <w:r>
+              <w:rPr>
+                <w:rFonts w:ascii="Inter" w:cs="Inter" w:eastAsia="Inter" w:hAnsi="Inter"/>
+                <w:sz w:val="20"/>
+                <w:szCs w:val="20"/>
+                <w:rtl w:val="0"/>
+              </w:rPr>
+              <w:t xml:space="preserve">J2T Services Ltd</w:t>
+            </w:r>
+            <w:r>
+              <w:rPr>
+                <w:rFonts w:ascii="Inter" w:cs="Inter" w:eastAsia="Inter" w:hAnsi="Inter"/>
+                <w:b w:val="0"/>
+                <w:bCs w:val="0"/>
+                <w:i w:val="0"/>
+                <w:iCs w:val="0"/>
+                <w:smallCaps w:val="0"/>
+                <w:strike w:val="0"/>
+                <w:color w:val="000000"/>
+                <w:sz w:val="20"/>
+                <w:szCs w:val="20"/>
+                <w:u w:val="none"/>
+                <w:shd w:fill="auto" w:val="clear"/>
+                <w:vertAlign w:val="baseline"/>
+                <w:rtl w:val="0"/>
+              </w:rPr>
+              <w:t xml:space="preserve">. </w:t>
+            </w:r>
+          </w:p>
+          <w:p>
+            <w:pPr>
+              <w:keepNext w:val="0"/>
+              <w:keepLines w:val="0"/>
+              <w:pageBreakBefore w:val="0"/>
+              <w:widowControl w:val="0"/>
+              <w:pBdr>
+                <w:top w:space="0" w:sz="0" w:val="nil"/>
+                <w:left w:space="0" w:sz="0" w:val="nil"/>
+                <w:bottom w:space="0" w:sz="0" w:val="nil"/>
+                <w:right w:space="0" w:sz="0" w:val="nil"/>
+                <w:between w:space="0" w:sz="0" w:val="nil"/>
+              </w:pBdr>
+              <w:shd w:fill="auto" w:val="clear"/>
+              <w:spacing w:after="0" w:before="105.46142578125" w:line="240" w:lineRule="auto"/>
+              <w:ind w:left="0" w:right="0" w:firstLine="0"/>
+              <w:jc w:val="left"/>
+              <w:rPr>
+                <w:rFonts w:ascii="Inter" w:cs="Inter" w:eastAsia="Inter" w:hAnsi="Inter"/>
+                <w:b w:val="0"/>
+                <w:bCs w:val="0"/>
+                <w:i w:val="0"/>
+                <w:iCs w:val="0"/>
+                <w:smallCaps w:val="0"/>
+                <w:strike w:val="0"/>
+                <w:color w:val="000000"/>
+                <w:sz w:val="20"/>
+                <w:szCs w:val="20"/>
+                <w:u w:val="none"/>
+                <w:shd w:fill="auto" w:val="clear"/>
+                <w:vertAlign w:val="baseline"/>
+              </w:rPr>
+            </w:pPr>
+            <w:r>
+              <w:rPr>
+                <w:rFonts w:ascii="Inter" w:cs="Inter" w:eastAsia="Inter" w:hAnsi="Inter"/>
+                <w:b w:val="0"/>
+                <w:bCs w:val="0"/>
+                <w:i w:val="0"/>
+                <w:iCs w:val="0"/>
+                <w:smallCaps w:val="0"/>
+                <w:strike w:val="0"/>
+                <w:color w:val="000000"/>
+                <w:sz w:val="20"/>
+                <w:szCs w:val="20"/>
+                <w:u w:val="none"/>
+                <w:shd w:fill="auto" w:val="clear"/>
+                <w:vertAlign w:val="baseline"/>
+                <w:rtl w:val="0"/>
+              </w:rPr>
+              <w:t xml:space="preserve">CY10341520V </w:t>
+            </w:r>
+          </w:p>
+          <w:p>
+            <w:pPr>
+              <w:keepNext w:val="0"/>
+              <w:keepLines w:val="0"/>
+              <w:pageBreakBefore w:val="0"/>
+              <w:widowControl w:val="0"/>
+              <w:pBdr>
+                <w:top w:space="0" w:sz="0" w:val="nil"/>
+                <w:left w:space="0" w:sz="0" w:val="nil"/>
+                <w:bottom w:space="0" w:sz="0" w:val="nil"/>
+                <w:right w:space="0" w:sz="0" w:val="nil"/>
+                <w:between w:space="0" w:sz="0" w:val="nil"/>
+              </w:pBdr>
+              <w:shd w:fill="auto" w:val="clear"/>
+              <w:spacing w:after="0" w:before="105.479736328125" w:line="338.7243175506592" w:lineRule="auto"/>
+              <w:ind w:left="0" w:right="0" w:firstLine="0"/>
+              <w:jc w:val="left"/>
+              <w:rPr>
+                <w:rFonts w:ascii="Inter" w:cs="Inter" w:eastAsia="Inter" w:hAnsi="Inter"/>
+                <w:b w:val="0"/>
+                <w:bCs w:val="0"/>
+                <w:i w:val="0"/>
+                <w:iCs w:val="0"/>
+                <w:smallCaps w:val="0"/>
+                <w:strike w:val="0"/>
+                <w:color w:val="000000"/>
+                <w:sz w:val="20"/>
+                <w:szCs w:val="20"/>
+                <w:u w:val="none"/>
+                <w:shd w:fill="auto" w:val="clear"/>
+                <w:vertAlign w:val="baseline"/>
+              </w:rPr>
+            </w:pPr>
+            <w:r>
+              <w:rPr>
+                <w:rFonts w:ascii="Inter" w:cs="Inter" w:eastAsia="Inter" w:hAnsi="Inter"/>
+                <w:b w:val="0"/>
+                <w:bCs w:val="0"/>
+                <w:i w:val="0"/>
+                <w:iCs w:val="0"/>
+                <w:smallCaps w:val="0"/>
+                <w:strike w:val="0"/>
+                <w:color w:val="000000"/>
+                <w:sz w:val="20"/>
+                <w:szCs w:val="20"/>
+                <w:u w:val="none"/>
+                <w:shd w:fill="auto" w:val="clear"/>
+                <w:vertAlign w:val="baseline"/>
+                <w:rtl w:val="0"/>
+              </w:rPr>
+              <w:t xml:space="preserve">Spyrou Kyprianou, 78, 4B Magnum Business Center, 3076 </w:t>
+            </w:r>
+          </w:p>
+          <w:p>
+            <w:pPr>
+              <w:keepNext w:val="0"/>
+              <w:keepLines w:val="0"/>
+              <w:pageBreakBefore w:val="0"/>
+              <w:widowControl w:val="0"/>
+              <w:pBdr>
+                <w:top w:space="0" w:sz="0" w:val="nil"/>
+                <w:left w:space="0" w:sz="0" w:val="nil"/>
+                <w:bottom w:space="0" w:sz="0" w:val="nil"/>
+                <w:right w:space="0" w:sz="0" w:val="nil"/>
+                <w:between w:space="0" w:sz="0" w:val="nil"/>
+              </w:pBdr>
+              <w:shd w:fill="auto" w:val="clear"/>
+              <w:spacing w:after="0" w:before="23.189697265625" w:line="240" w:lineRule="auto"/>
+              <w:ind w:left="0" w:right="0" w:firstLine="0"/>
+              <w:jc w:val="left"/>
+              <w:rPr>
+                <w:rFonts w:ascii="Inter" w:cs="Inter" w:eastAsia="Inter" w:hAnsi="Inter"/>
+                <w:b w:val="0"/>
+                <w:bCs w:val="0"/>
+                <w:i w:val="0"/>
+                <w:iCs w:val="0"/>
+                <w:smallCaps w:val="0"/>
+                <w:strike w:val="0"/>
+                <w:color w:val="000000"/>
+                <w:sz w:val="20"/>
+                <w:szCs w:val="20"/>
+                <w:u w:val="none"/>
+                <w:shd w:fill="auto" w:val="clear"/>
+                <w:vertAlign w:val="baseline"/>
+              </w:rPr>
+            </w:pPr>
+            <w:r>
+              <w:rPr>
+                <w:rFonts w:ascii="Inter" w:cs="Inter" w:eastAsia="Inter" w:hAnsi="Inter"/>
+                <w:b w:val="0"/>
+                <w:bCs w:val="0"/>
+                <w:i w:val="0"/>
+                <w:iCs w:val="0"/>
+                <w:smallCaps w:val="0"/>
+                <w:strike w:val="0"/>
+                <w:color w:val="000000"/>
+                <w:sz w:val="20"/>
+                <w:szCs w:val="20"/>
+                <w:u w:val="none"/>
+                <w:shd w:fill="auto" w:val="clear"/>
+                <w:vertAlign w:val="baseline"/>
+                <w:rtl w:val="0"/>
+              </w:rPr>
+              <w:t xml:space="preserve">Limassol, 3076, Cyprus </w:t>
+            </w:r>
+          </w:p>
+        </w:tc>
+        <w:tc>
+          <w:tcPr>
+            <w:tcW w:w="5147" w:type="dxa"/>
+            <w:vAlign w:val="top"/>
+          </w:tcPr>
+          <w:p>
+            <w:pPr>
+              <w:keepNext w:val="0"/>
+              <w:keepLines w:val="0"/>
+              <w:pageBreakBefore w:val="0"/>
+              <w:widowControl w:val="0"/>
+              <w:pBdr>
+                <w:top w:space="0" w:sz="0" w:val="nil"/>
+                <w:left w:space="0" w:sz="0" w:val="nil"/>
+                <w:bottom w:space="0" w:sz="0" w:val="nil"/>
+                <w:right w:space="0" w:sz="0" w:val="nil"/>
+                <w:between w:space="0" w:sz="0" w:val="nil"/>
+              </w:pBdr>
+              <w:shd w:fill="auto" w:val="clear"/>
+              <w:spacing w:after="0" w:before="2420.53955078125" w:line="240" w:lineRule="auto"/>
+              <w:ind w:left="0" w:right="0" w:firstLine="0"/>
+              <w:jc w:val="left"/>
+              <w:rPr>
+                <w:rFonts w:ascii="Inter" w:cs="Inter" w:eastAsia="Inter" w:hAnsi="Inter"/>
+                <w:b w:val="0"/>
+                <w:bCs w:val="0"/>
+                <w:i w:val="0"/>
+                <w:iCs w:val="0"/>
+                <w:smallCaps w:val="0"/>
+                <w:strike w:val="0"/>
+                <w:color w:val="000000"/>
+                <w:sz w:val="20"/>
+                <w:szCs w:val="20"/>
+                <w:u w:val="none"/>
+                <w:shd w:fill="auto" w:val="clear"/>
+                <w:vertAlign w:val="baseline"/>
+              </w:rPr>
+            </w:pPr>
+            <w:r>
+              <w:rPr>
+                <w:rFonts w:ascii="Inter" w:cs="Inter" w:eastAsia="Inter" w:hAnsi="Inter"/>
+                <w:b w:val="0"/>
+                <w:bCs w:val="0"/>
+                <w:i w:val="0"/>
+                <w:iCs w:val="0"/>
+                <w:smallCaps w:val="0"/>
+                <w:strike w:val="0"/>
+                <w:color w:val="000000"/>
+                <w:sz w:val="20"/>
+                <w:szCs w:val="20"/>
+                <w:u w:val="none"/>
+                <w:shd w:fill="auto" w:val="clear"/>
+                <w:vertAlign w:val="baseline"/>
+                <w:rtl w:val="0"/>
+              </w:rPr>
+              <w:t xml:space="preserve">From </w:t>
+            </w:r>
+          </w:p>
+          <w:p>
+            <w:pPr>
+              <w:keepNext w:val="0"/>
+              <w:keepLines w:val="0"/>
+              <w:pageBreakBefore w:val="0"/>
+              <w:widowControl w:val="0"/>
+              <w:pBdr>
+                <w:top w:space="0" w:sz="0" w:val="nil"/>
+                <w:left w:space="0" w:sz="0" w:val="nil"/>
+                <w:bottom w:space="0" w:sz="0" w:val="nil"/>
+                <w:right w:space="0" w:sz="0" w:val="nil"/>
+                <w:between w:space="0" w:sz="0" w:val="nil"/>
+              </w:pBdr>
+              <w:shd w:fill="auto" w:val="clear"/>
+              <w:spacing w:after="0" w:before="105.460205078125" w:line="240" w:lineRule="auto"/>
+              <w:ind w:left="0" w:right="0" w:firstLine="0"/>
+              <w:jc w:val="left"/>
+              <w:rPr>
+                <w:rFonts w:ascii="Inter" w:cs="Inter" w:eastAsia="Inter" w:hAnsi="Inter"/>
+                <w:b w:val="0"/>
+                <w:bCs w:val="0"/>
+                <w:i w:val="0"/>
+                <w:iCs w:val="0"/>
+                <w:smallCaps w:val="0"/>
+                <w:strike w:val="0"/>
+                <w:color w:val="000000"/>
+                <w:sz w:val="20"/>
+                <w:szCs w:val="20"/>
+                <w:u w:val="none"/>
+                <w:shd w:fill="auto" w:val="clear"/>
+                <w:vertAlign w:val="baseline"/>
+              </w:rPr>
+            </w:pPr>
+            <w:r>
+              <w:rPr>
+                <w:rFonts w:ascii="Inter" w:cs="Inter" w:eastAsia="Inter" w:hAnsi="Inter"/>
+                <w:b w:val="0"/>
+                <w:bCs w:val="0"/>
+                <w:i w:val="0"/>
+                <w:iCs w:val="0"/>
+                <w:smallCaps w:val="0"/>
+                <w:strike w:val="0"/>
+                <w:color w:val="000000"/>
+                <w:sz w:val="20"/>
+                <w:szCs w:val="20"/>
+                <w:u w:val="none"/>
+                <w:shd w:fill="auto" w:val="clear"/>
+                <w:vertAlign w:val="baseline"/>
+                <w:rtl w:val="0"/>
+              </w:rPr>
+              <w:t xml:space="preserve">VITALII IASINSKII </w:t>
+            </w:r>
+          </w:p>
+          <w:p>
+            <w:pPr>
+              <w:keepNext w:val="0"/>
+              <w:keepLines w:val="0"/>
+              <w:pageBreakBefore w:val="0"/>
+              <w:widowControl w:val="0"/>
+              <w:pBdr>
+                <w:top w:space="0" w:sz="0" w:val="nil"/>
+                <w:left w:space="0" w:sz="0" w:val="nil"/>
+                <w:bottom w:space="0" w:sz="0" w:val="nil"/>
+                <w:right w:space="0" w:sz="0" w:val="nil"/>
+                <w:between w:space="0" w:sz="0" w:val="nil"/>
+              </w:pBdr>
+              <w:shd w:fill="auto" w:val="clear"/>
+              <w:spacing w:after="0" w:before="105.46142578125" w:line="240" w:lineRule="auto"/>
+              <w:ind w:left="0" w:right="0" w:firstLine="0"/>
+              <w:jc w:val="left"/>
+              <w:rPr>
+                <w:rFonts w:ascii="Inter" w:cs="Inter" w:eastAsia="Inter" w:hAnsi="Inter"/>
+                <w:b w:val="0"/>
+                <w:bCs w:val="0"/>
+                <w:i w:val="0"/>
+                <w:iCs w:val="0"/>
+                <w:smallCaps w:val="0"/>
+                <w:strike w:val="0"/>
+                <w:color w:val="000000"/>
+                <w:sz w:val="20"/>
+                <w:szCs w:val="20"/>
+                <w:u w:val="none"/>
+                <w:shd w:fill="auto" w:val="clear"/>
+                <w:vertAlign w:val="baseline"/>
+              </w:rPr>
+            </w:pPr>
+            <w:r>
+              <w:rPr>
+                <w:rFonts w:ascii="Inter" w:cs="Inter" w:eastAsia="Inter" w:hAnsi="Inter"/>
+                <w:b w:val="0"/>
+                <w:bCs w:val="0"/>
+                <w:i w:val="0"/>
+                <w:iCs w:val="0"/>
+                <w:smallCaps w:val="0"/>
+                <w:strike w:val="0"/>
+                <w:color w:val="000000"/>
+                <w:sz w:val="20"/>
+                <w:szCs w:val="20"/>
+                <w:u w:val="none"/>
+                <w:shd w:fill="auto" w:val="clear"/>
+                <w:vertAlign w:val="baseline"/>
+                <w:rtl w:val="0"/>
+              </w:rPr>
+              <w:t xml:space="preserve">ESZ1154366R </w:t>
+            </w:r>
+          </w:p>
+          <w:p>
+            <w:pPr>
+              <w:widowControl w:val="0"/>
+              <w:spacing w:before="276.663818359375" w:line="244.04296875" w:lineRule="auto"/>
+              <w:ind w:left="8.799896240234375" w:right="12.0263671875" w:firstLine="4.840087890625"/>
+              <w:jc w:val="both"/>
+              <w:rPr>
+                <w:rFonts w:ascii="Inter" w:cs="Inter" w:eastAsia="Inter" w:hAnsi="Inter"/>
+                <w:b w:val="0"/>
+                <w:bCs w:val="0"/>
+                <w:i w:val="0"/>
+                <w:iCs w:val="0"/>
+                <w:smallCaps w:val="0"/>
+                <w:strike w:val="0"/>
+                <w:color w:val="000000"/>
+                <w:sz w:val="20"/>
+                <w:szCs w:val="20"/>
+                <w:u w:val="none"/>
+                <w:shd w:fill="auto" w:val="clear"/>
+                <w:vertAlign w:val="baseline"/>
+              </w:rPr>
+            </w:pPr>
+            <w:r>
+              <w:rPr>
+                <w:rFonts w:ascii="Calibri" w:cs="Calibri" w:eastAsia="Calibri" w:hAnsi="Calibri"/>
+                <w:rtl w:val="0"/>
+              </w:rPr>
+              <w:t xml:space="preserve">12166, ronda Albocacer, 11, Els Ibarsos, Sierra Engarceran, Castellon, Spain</w:t>
+            </w:r>
+            <w:r>
+              <w:rPr>
+                <w:rtl w:val="0"/>
+              </w:rPr>
+            </w:r>
+          </w:p>
+        </w:tc>
+      </w:tr>
+    </w:tbl>
     <w:tbl>
       <w:tblPr>
         <w:tblStyle w:val="Table1"/>
@@ -1943,7 +1938,7 @@
                 <w:szCs w:val="20"/>
                 <w:rtl w:val="0"/>
               </w:rPr>
-              <w:t xml:space="preserve">Invoice exempt from VAT pursuant to Directive 2006/112/EC and art. 25 of VAT Law 37/1992.</w:t>
+              <w:t xml:space="preserve">Reverse charge — VAT to be accounted for by the recipient (Art. 196 Directive 2006/112/EC). Supply not subject to Spanish VAT (Art. 69 Spanish VAT Law 37/1992). English version of the original invoice F-0010-2026 issued in Spanish.</w:t>
             </w:r>
           </w:p>
         </w:tc>
@@ -1991,7 +1986,7 @@
     <w:sectPr>
       <w:type w:val="continuous"/>
       <w:pgSz w:h="16840" w:w="11900" w:orient="portrait"/>
-      <w:pgMar w:bottom="2041.6000366210938" w:top="828.800048828125" w:left="805.1999664306641" w:right="799.24072265625" w:header="0" w:footer="720"/>
+      <w:pgMar w:bottom="1000" w:top="828.800048828125" w:left="805.1999664306641" w:right="799.24072265625" w:header="0" w:footer="720"/>
       <w:cols w:equalWidth="0" w:num="1">
         <w:col w:space="0" w:w="10295.559310913086"/>
       </w:cols>

</xml_diff>